<commit_message>
Add Linux and cloud infrastructure lab projects
</commit_message>
<xml_diff>
--- a/Kenneth Delliber Jr Resume.docx
+++ b/Kenneth Delliber Jr Resume.docx
@@ -26,7 +26,7 @@
           <w:b/>
           <w:sz w:val="20"/>
         </w:rPr>
-        <w:t>IT SUPPORT • DESKTOP SUPPORT • NETWORK SUPPORT</w:t>
+        <w:t>IT SUPPORT • LINUX • CLOUD &amp; NETWORK SUPPORT</w:t>
       </w:r>
     </w:p>
     <w:p>
@@ -74,7 +74,7 @@
         <w:spacing w:after="40"/>
       </w:pPr>
       <w:r>
-        <w:t>CompTIA A+ and Network+ certified technology graduate transitioning into IT support, with an Associate in Specialized Technology and a Certificate in Computer and Networking Technologies, both earned with a 4.0 GPA. Hands-on academic and self-directed labs include Windows support, Windows Server and Active Directory, PC hardware, networking, security monitoring, PowerShell, and ticket documentation. Built and deployed a technical portfolio on GitHub Pages. Brings more than 20 years of stable manufacturing and warehouse experience.</w:t>
+        <w:t>CompTIA A+ and Network+ certified technology graduate transitioning into IT support, with an Associate in Specialized Technology and a Certificate in Computer and Networking Technologies, both earned with a 4.0 GPA. Hands-on academic and self-directed labs include Linux administration, virtualization, AWS cloud infrastructure, Windows Server and Active Directory, networking, security monitoring, PowerShell, and ticket documentation. Built and deployed a technical portfolio on GitHub Pages. Brings more than 20 years of stable manufacturing and warehouse experience.</w:t>
       </w:r>
     </w:p>
     <w:p>
@@ -191,11 +191,8 @@
             <w:vAlign w:val="top"/>
           </w:tcPr>
           <w:p>
-            <w:pPr>
-              <w:spacing w:after="0"/>
-            </w:pPr>
             <w:r>
-              <w:t>Windows Server; Windows desktop systems; basic Linux administration; PC hardware maintenance, upgrades, and troubleshooting</w:t>
+              <w:t>Windows Server; Windows desktop systems; Linux administration fundamentals; virtualization; AWS cloud fundamentals; PC hardware maintenance, upgrades, and troubleshooting</w:t>
             </w:r>
           </w:p>
         </w:tc>
@@ -271,7 +268,7 @@
           <w:b/>
           <w:sz w:val="20"/>
         </w:rPr>
-        <w:t>• Windows Server &amp; Active Directory Labs — Configured virtual servers and practiced networking, accounts, groups, permissions, and access administration.</w:t>
+        <w:t>• Systems &amp; Cloud Labs — Deployed virtual servers and practiced Windows Server, Active Directory, Fedora Linux administration, AWS EC2, IAM, security groups, and network ACLs.</w:t>
       </w:r>
     </w:p>
     <w:p>
@@ -282,7 +279,7 @@
         <w:rPr>
           <w:b/>
         </w:rPr>
-        <w:t>• Network &amp; Security Labs — Used Packet Tracer, Wireshark, Windows Firewall, Event Viewer, and PowerShell for configuration and investigation.</w:t>
+        <w:t>• Network &amp; Security Labs — Used Packet Tracer, Wireshark, Windows Firewall, Event Viewer, and PowerShell for network configuration, troubleshooting, and investigation.</w:t>
       </w:r>
       <w:r>
         <w:t xml:space="preserve"/>

</xml_diff>